<commit_message>
Full end-to-end R Markdown verification run; landscape literature table
- 06_output/knit_check/HEOR_Tirzepatide_Analysis.md: knitr output of the complete Rmd (all chunks ran, results identical to the scripts)
- Literature synthesis table on landscape pages; documents rebuilt with final figures

Co-Authored-By: Claude Opus 5.5 <noreply@anthropic.com>
</commit_message>
<xml_diff>
--- a/01_protocol/02_Literature_Review_and_Synthesis.docx
+++ b/01_protocol/02_Literature_Review_and_Synthesis.docx
@@ -191,6 +191,16 @@
     </w:p>
     <w:p>
       <w:pPr>
+        <w:sectPr>
+          <w:pgMar w:header="708" w:bottom="1417" w:top="1417" w:right="1417" w:left="1417" w:footer="708" w:gutter="0"/>
+          <w:pgSz w:h="16838" w:w="11906" w:orient="portrait"/>
+          <w:type w:val="oddPage"/>
+          <w:cols/>
+        </w:sectPr>
+      </w:pPr>
+    </w:p>
+    <w:p>
+      <w:pPr>
         <w:pStyle w:val="Normal"/>
         <w:jc w:val="left"/>
         <w:pBdr>
@@ -5488,6 +5498,16 @@
       <w:r>
         <w:t xml:space="preserve"/>
       </w:r>
+    </w:p>
+    <w:p>
+      <w:pPr>
+        <w:sectPr>
+          <w:pgMar w:header="708" w:bottom="1417" w:top="1417" w:right="1417" w:left="1417" w:footer="708" w:gutter="0"/>
+          <w:pgSz w:h="11906" w:w="16838" w:orient="landscape"/>
+          <w:type w:val="oddPage"/>
+          <w:cols/>
+        </w:sectPr>
+      </w:pPr>
     </w:p>
     <w:p>
       <w:pPr>

</xml_diff>

<commit_message>
Paper cites all 18 literature sources; add E-value reference across documents
- Research paper: Introduction, Methods and Discussion revised so every literature-folder source
  (plus VanderWeele & Ding 2017) is cited in text; Hoog 2026 in-text citation fixed; 19 references
- VanderWeele & Ding 2017 added to literature review (Table B, synthesis), SAP (S10; editorial
  amendment v1.1), DAG document, step summary, R Markdown and script comment
- Open-access author manuscript saved locally to 01_protocol/literature (not pushed; README updated)

Co-Authored-By: Claude Opus 5.5 <noreply@anthropic.com>
</commit_message>
<xml_diff>
--- a/01_protocol/02_Literature_Review_and_Synthesis.docx
+++ b/01_protocol/02_Literature_Review_and_Synthesis.docx
@@ -160,7 +160,7 @@
           <w:szCs w:val="21"/>
           <w:color w:val="000000"/>
         </w:rPr>
-        <w:t xml:space="preserve">, Appendix A). Two searches (109 and 46 records; 146 unique) were screened by title and abstract; 10 real-world head-to-head studies were retained. Eight further sources were added by hand because they define the clinical context, the economic context or the methods: two randomized trials (SURMOUNT-5, SURMOUNT-4), a discontinuation cohort (Gasoyan 2025), a payer research report (Prime Therapeutics 2025), two economic evaluations (ICER 2025, Hwang 2025) and two methods papers (Hernán &amp; Robins 2016; RECORD-PE). Full texts are stored in </w:t>
+        <w:t xml:space="preserve">, Appendix A). Two searches (109 and 46 records; 146 unique) were screened by title and abstract; 10 real-world head-to-head studies were retained. Nine further sources were added by hand because they define the clinical context, the economic context or the methods: two randomized trials (SURMOUNT-5, SURMOUNT-4), a discontinuation cohort (Gasoyan 2025), a payer research report (Prime Therapeutics 2025), two economic evaluations (ICER 2025, Hwang 2025) and three methods papers (Hernán &amp; Robins 2016; RECORD-PE; VanderWeele &amp; Ding 2017). VanderWeele &amp; Ding was added when the SAP's bias analysis (E-values) was specified. Full texts are stored in </w:t>
       </w:r>
       <w:r>
         <w:rPr>
@@ -7106,6 +7106,228 @@
         <w:tc>
           <w:tcPr>
             <w:tcBorders>
+              <w:bottom w:val="none" w:sz="0" w:space="0" w:color="000000"/>
+              <w:top w:val="none" w:sz="0" w:space="0" w:color="000000"/>
+              <w:left w:val="none" w:sz="0" w:space="0" w:color="000000"/>
+              <w:right w:val="none" w:sz="0" w:space="0" w:color="000000"/>
+            </w:tcBorders>
+            <w:shd w:val="clear" w:color="auto" w:fill="FFFFFF"/>
+            <w:tcMar>
+              <w:top w:w="0" w:type="dxa"/>
+              <w:bottom w:w="0" w:type="dxa"/>
+              <w:left w:w="0" w:type="dxa"/>
+              <w:right w:w="0" w:type="dxa"/>
+            </w:tcMar>
+            <w:vAlign w:val="top"/>
+          </w:tcPr>
+          <w:p>
+            <w:pPr>
+              <w:jc w:val="left"/>
+              <w:pBdr>
+                <w:bottom w:val="none" w:sz="0" w:space="0" w:color="000000"/>
+                <w:top w:val="none" w:sz="0" w:space="0" w:color="000000"/>
+                <w:left w:val="none" w:sz="0" w:space="0" w:color="000000"/>
+                <w:right w:val="none" w:sz="0" w:space="0" w:color="000000"/>
+              </w:pBdr>
+              <w:spacing w:after="40" w:before="40" w:line="240"/>
+              <w:ind w:left="40" w:right="40" w:firstLine="0" w:firstLineChars="0"/>
+              <w:rPr>
+                <w:rFonts w:ascii="Arial" w:hAnsi="Arial" w:eastAsia="Arial" w:cs="Arial"/>
+                <w:i w:val="false"/>
+                <w:b w:val="false"/>
+                <w:u w:val="none"/>
+                <w:strike w:val="false"/>
+                <w:sz w:val="17"/>
+                <w:szCs w:val="17"/>
+                <w:color w:val="000000"/>
+              </w:rPr>
+            </w:pPr>
+            <w:r>
+              <w:rPr>
+                <w:rFonts w:ascii="Arial" w:hAnsi="Arial" w:eastAsia="Arial" w:cs="Arial"/>
+                <w:i w:val="false"/>
+                <w:b w:val="false"/>
+                <w:u w:val="none"/>
+                <w:strike w:val="false"/>
+                <w:sz w:val="17"/>
+                <w:szCs w:val="17"/>
+                <w:color w:val="000000"/>
+              </w:rPr>
+              <w:t xml:space="preserve">Langan 2018, BMJ (RECORD-PE)</w:t>
+            </w:r>
+          </w:p>
+        </w:tc>
+        <w:tc>
+          <w:tcPr>
+            <w:tcBorders>
+              <w:bottom w:val="none" w:sz="0" w:space="0" w:color="000000"/>
+              <w:top w:val="none" w:sz="0" w:space="0" w:color="000000"/>
+              <w:left w:val="none" w:sz="0" w:space="0" w:color="000000"/>
+              <w:right w:val="none" w:sz="0" w:space="0" w:color="000000"/>
+            </w:tcBorders>
+            <w:shd w:val="clear" w:color="auto" w:fill="FFFFFF"/>
+            <w:tcMar>
+              <w:top w:w="0" w:type="dxa"/>
+              <w:bottom w:w="0" w:type="dxa"/>
+              <w:left w:w="0" w:type="dxa"/>
+              <w:right w:w="0" w:type="dxa"/>
+            </w:tcMar>
+            <w:vAlign w:val="top"/>
+          </w:tcPr>
+          <w:p>
+            <w:pPr>
+              <w:jc w:val="left"/>
+              <w:pBdr>
+                <w:bottom w:val="none" w:sz="0" w:space="0" w:color="000000"/>
+                <w:top w:val="none" w:sz="0" w:space="0" w:color="000000"/>
+                <w:left w:val="none" w:sz="0" w:space="0" w:color="000000"/>
+                <w:right w:val="none" w:sz="0" w:space="0" w:color="000000"/>
+              </w:pBdr>
+              <w:spacing w:after="40" w:before="40" w:line="240"/>
+              <w:ind w:left="40" w:right="40" w:firstLine="0" w:firstLineChars="0"/>
+              <w:rPr>
+                <w:rFonts w:ascii="Arial" w:hAnsi="Arial" w:eastAsia="Arial" w:cs="Arial"/>
+                <w:i w:val="false"/>
+                <w:b w:val="false"/>
+                <w:u w:val="none"/>
+                <w:strike w:val="false"/>
+                <w:sz w:val="17"/>
+                <w:szCs w:val="17"/>
+                <w:color w:val="000000"/>
+              </w:rPr>
+            </w:pPr>
+            <w:r>
+              <w:rPr>
+                <w:rFonts w:ascii="Arial" w:hAnsi="Arial" w:eastAsia="Arial" w:cs="Arial"/>
+                <w:i w:val="false"/>
+                <w:b w:val="false"/>
+                <w:u w:val="none"/>
+                <w:strike w:val="false"/>
+                <w:sz w:val="17"/>
+                <w:szCs w:val="17"/>
+                <w:color w:val="000000"/>
+              </w:rPr>
+              <w:t xml:space="preserve">Reporting guideline</w:t>
+            </w:r>
+          </w:p>
+        </w:tc>
+        <w:tc>
+          <w:tcPr>
+            <w:tcBorders>
+              <w:bottom w:val="none" w:sz="0" w:space="0" w:color="000000"/>
+              <w:top w:val="none" w:sz="0" w:space="0" w:color="000000"/>
+              <w:left w:val="none" w:sz="0" w:space="0" w:color="000000"/>
+              <w:right w:val="none" w:sz="0" w:space="0" w:color="000000"/>
+            </w:tcBorders>
+            <w:shd w:val="clear" w:color="auto" w:fill="FFFFFF"/>
+            <w:tcMar>
+              <w:top w:w="0" w:type="dxa"/>
+              <w:bottom w:w="0" w:type="dxa"/>
+              <w:left w:w="0" w:type="dxa"/>
+              <w:right w:w="0" w:type="dxa"/>
+            </w:tcMar>
+            <w:vAlign w:val="top"/>
+          </w:tcPr>
+          <w:p>
+            <w:pPr>
+              <w:jc w:val="left"/>
+              <w:pBdr>
+                <w:bottom w:val="none" w:sz="0" w:space="0" w:color="000000"/>
+                <w:top w:val="none" w:sz="0" w:space="0" w:color="000000"/>
+                <w:left w:val="none" w:sz="0" w:space="0" w:color="000000"/>
+                <w:right w:val="none" w:sz="0" w:space="0" w:color="000000"/>
+              </w:pBdr>
+              <w:spacing w:after="40" w:before="40" w:line="240"/>
+              <w:ind w:left="40" w:right="40" w:firstLine="0" w:firstLineChars="0"/>
+              <w:rPr>
+                <w:rFonts w:ascii="Arial" w:hAnsi="Arial" w:eastAsia="Arial" w:cs="Arial"/>
+                <w:i w:val="false"/>
+                <w:b w:val="false"/>
+                <w:u w:val="none"/>
+                <w:strike w:val="false"/>
+                <w:sz w:val="17"/>
+                <w:szCs w:val="17"/>
+                <w:color w:val="000000"/>
+              </w:rPr>
+            </w:pPr>
+            <w:r>
+              <w:rPr>
+                <w:rFonts w:ascii="Arial" w:hAnsi="Arial" w:eastAsia="Arial" w:cs="Arial"/>
+                <w:i w:val="false"/>
+                <w:b w:val="false"/>
+                <w:u w:val="none"/>
+                <w:strike w:val="false"/>
+                <w:sz w:val="17"/>
+                <w:szCs w:val="17"/>
+                <w:color w:val="000000"/>
+              </w:rPr>
+              <w:t xml:space="preserve">Items for pharmacoepidemiology studies using routinely collected data</w:t>
+            </w:r>
+          </w:p>
+        </w:tc>
+        <w:tc>
+          <w:tcPr>
+            <w:tcBorders>
+              <w:bottom w:val="none" w:sz="0" w:space="0" w:color="000000"/>
+              <w:top w:val="none" w:sz="0" w:space="0" w:color="000000"/>
+              <w:left w:val="none" w:sz="0" w:space="0" w:color="000000"/>
+              <w:right w:val="none" w:sz="0" w:space="0" w:color="000000"/>
+            </w:tcBorders>
+            <w:shd w:val="clear" w:color="auto" w:fill="FFFFFF"/>
+            <w:tcMar>
+              <w:top w:w="0" w:type="dxa"/>
+              <w:bottom w:w="0" w:type="dxa"/>
+              <w:left w:w="0" w:type="dxa"/>
+              <w:right w:w="0" w:type="dxa"/>
+            </w:tcMar>
+            <w:vAlign w:val="top"/>
+          </w:tcPr>
+          <w:p>
+            <w:pPr>
+              <w:jc w:val="left"/>
+              <w:pBdr>
+                <w:bottom w:val="none" w:sz="0" w:space="0" w:color="000000"/>
+                <w:top w:val="none" w:sz="0" w:space="0" w:color="000000"/>
+                <w:left w:val="none" w:sz="0" w:space="0" w:color="000000"/>
+                <w:right w:val="none" w:sz="0" w:space="0" w:color="000000"/>
+              </w:pBdr>
+              <w:spacing w:after="40" w:before="40" w:line="240"/>
+              <w:ind w:left="40" w:right="40" w:firstLine="0" w:firstLineChars="0"/>
+              <w:rPr>
+                <w:rFonts w:ascii="Arial" w:hAnsi="Arial" w:eastAsia="Arial" w:cs="Arial"/>
+                <w:i w:val="false"/>
+                <w:b w:val="false"/>
+                <w:u w:val="none"/>
+                <w:strike w:val="false"/>
+                <w:sz w:val="17"/>
+                <w:szCs w:val="17"/>
+                <w:color w:val="000000"/>
+              </w:rPr>
+            </w:pPr>
+            <w:r>
+              <w:rPr>
+                <w:rFonts w:ascii="Arial" w:hAnsi="Arial" w:eastAsia="Arial" w:cs="Arial"/>
+                <w:i w:val="false"/>
+                <w:b w:val="false"/>
+                <w:u w:val="none"/>
+                <w:strike w:val="false"/>
+                <w:sz w:val="17"/>
+                <w:szCs w:val="17"/>
+                <w:color w:val="000000"/>
+              </w:rPr>
+              <w:t xml:space="preserve">Reporting checklist</w:t>
+            </w:r>
+          </w:p>
+        </w:tc>
+      </w:tr>
+      <w:tr>
+        <w:trPr>
+          <w:trHeight w:val="360" w:hRule="auto"/>
+        </w:trPr>
+        body8
+        <w:tc>
+          <w:tcPr>
+            <w:tcBorders>
               <w:bottom w:val="single" w:sz="12" w:space="0" w:color="666666"/>
               <w:top w:val="none" w:sz="0" w:space="0" w:color="000000"/>
               <w:left w:val="none" w:sz="0" w:space="0" w:color="000000"/>
@@ -7153,7 +7375,7 @@
                 <w:szCs w:val="17"/>
                 <w:color w:val="000000"/>
               </w:rPr>
-              <w:t xml:space="preserve">Langan 2018, BMJ (RECORD-PE)</w:t>
+              <w:t xml:space="preserve">VanderWeele &amp; Ding 2017, Ann Intern Med</w:t>
             </w:r>
           </w:p>
         </w:tc>
@@ -7207,7 +7429,7 @@
                 <w:szCs w:val="17"/>
                 <w:color w:val="000000"/>
               </w:rPr>
-              <w:t xml:space="preserve">Reporting guideline</w:t>
+              <w:t xml:space="preserve">Methods</w:t>
             </w:r>
           </w:p>
         </w:tc>
@@ -7261,7 +7483,7 @@
                 <w:szCs w:val="17"/>
                 <w:color w:val="000000"/>
               </w:rPr>
-              <w:t xml:space="preserve">Items for pharmacoepidemiology studies using routinely collected data</w:t>
+              <w:t xml:space="preserve">Introduces the E-value: the minimum strength of association, on the risk ratio scale, that an unmeasured confounder would need with both treatment and outcome to explain away an observed association; recommends reporting it for the estimate and the confidence limit closest to the null</w:t>
             </w:r>
           </w:p>
         </w:tc>
@@ -7315,7 +7537,7 @@
                 <w:szCs w:val="17"/>
                 <w:color w:val="000000"/>
               </w:rPr>
-              <w:t xml:space="preserve">Reporting checklist</w:t>
+              <w:t xml:space="preserve">Quantitative bias analysis for unmeasured confounding (SAP sensitivity analysis S10)</w:t>
             </w:r>
           </w:p>
         </w:tc>
@@ -7580,7 +7802,47 @@
           <w:szCs w:val="21"/>
           <w:color w:val="000000"/>
         </w:rPr>
-        <w:t xml:space="preserve">6. Common limitations to avoid:</w:t>
+        <w:t xml:space="preserve">6. Unmeasured confounding is the main threat in all prior observational comparisons.</w:t>
+      </w:r>
+      <w:r>
+        <w:rPr>
+          <w:rFonts w:ascii="Arial" w:hAnsi="Arial" w:eastAsia="Arial" w:cs="Arial"/>
+          <w:i w:val="false"/>
+          <w:b w:val="false"/>
+          <w:u w:val="none"/>
+          <w:strike w:val="false"/>
+          <w:sz w:val="21"/>
+          <w:szCs w:val="21"/>
+          <w:color w:val="000000"/>
+        </w:rPr>
+        <w:t xml:space="preserve"> None of the retained studies quantified how strong an unmeasured confounder (for example, patient preference or socioeconomic status) would need to be to change its conclusions. This study therefore pre-specifies E-values (VanderWeele &amp; Ding 2017) and a negative control outcome as bias analyses.</w:t>
+      </w:r>
+    </w:p>
+    <w:p>
+      <w:pPr>
+        <w:pStyle w:val="Normal"/>
+        <w:jc w:val="left"/>
+        <w:pBdr>
+          <w:bottom w:val="none" w:sz="0" w:space="0" w:color="000000"/>
+          <w:top w:val="none" w:sz="0" w:space="0" w:color="000000"/>
+          <w:left w:val="none" w:sz="0" w:space="0" w:color="000000"/>
+          <w:right w:val="none" w:sz="0" w:space="0" w:color="000000"/>
+        </w:pBdr>
+        <w:spacing w:after="80" w:before="0" w:line="264"/>
+        <w:ind w:left="0" w:right="0" w:firstLine="0" w:firstLineChars="0"/>
+      </w:pPr>
+      <w:r>
+        <w:rPr>
+          <w:rFonts w:ascii="Arial" w:hAnsi="Arial" w:eastAsia="Arial" w:cs="Arial"/>
+          <w:i w:val="false"/>
+          <w:b w:val="true"/>
+          <w:u w:val="none"/>
+          <w:strike w:val="false"/>
+          <w:sz w:val="21"/>
+          <w:szCs w:val="21"/>
+          <w:color w:val="000000"/>
+        </w:rPr>
+        <w:t xml:space="preserve">7. Common limitations to avoid:</w:t>
       </w:r>
       <w:r>
         <w:rPr>
@@ -7620,7 +7882,7 @@
           <w:szCs w:val="21"/>
           <w:color w:val="000000"/>
         </w:rPr>
-        <w:t xml:space="preserve">7. Value context.</w:t>
+        <w:t xml:space="preserve">8. Value context.</w:t>
       </w:r>
       <w:r>
         <w:rPr>
@@ -8381,6 +8643,46 @@
           <w:color w:val="000000"/>
         </w:rPr>
         <w:t xml:space="preserve">Langan SM, et al. The RECORD-PE statement. BMJ. 2018;363:k3532.</w:t>
+      </w:r>
+    </w:p>
+    <w:p>
+      <w:pPr>
+        <w:pStyle w:val="Normal"/>
+        <w:jc w:val="left"/>
+        <w:pBdr>
+          <w:bottom w:val="none" w:sz="0" w:space="0" w:color="000000"/>
+          <w:top w:val="none" w:sz="0" w:space="0" w:color="000000"/>
+          <w:left w:val="none" w:sz="0" w:space="0" w:color="000000"/>
+          <w:right w:val="none" w:sz="0" w:space="0" w:color="000000"/>
+        </w:pBdr>
+        <w:spacing w:after="80" w:before="0" w:line="264"/>
+        <w:ind w:left="280" w:right="0" w:firstLine="0" w:firstLineChars="0"/>
+      </w:pPr>
+      <w:r>
+        <w:rPr>
+          <w:rFonts w:ascii="Arial" w:hAnsi="Arial" w:eastAsia="Arial" w:cs="Arial"/>
+          <w:i w:val="false"/>
+          <w:b w:val="false"/>
+          <w:u w:val="none"/>
+          <w:strike w:val="false"/>
+          <w:sz w:val="21"/>
+          <w:szCs w:val="21"/>
+          <w:color w:val="000000"/>
+        </w:rPr>
+        <w:t xml:space="preserve">19.  </w:t>
+      </w:r>
+      <w:r>
+        <w:rPr>
+          <w:rFonts w:ascii="Arial" w:hAnsi="Arial" w:eastAsia="Arial" w:cs="Arial"/>
+          <w:i w:val="false"/>
+          <w:b w:val="false"/>
+          <w:u w:val="none"/>
+          <w:strike w:val="false"/>
+          <w:sz w:val="21"/>
+          <w:szCs w:val="21"/>
+          <w:color w:val="000000"/>
+        </w:rPr>
+        <w:t xml:space="preserve">VanderWeele TJ, Ding P. Sensitivity analysis in observational research: introducing the E-value. Ann Intern Med. 2017;167(4):268-274. doi:10.7326/M16-2607</w:t>
       </w:r>
     </w:p>
     <w:sectPr>

</xml_diff>